<commit_message>
English demo documents and README screenshots; sample is branded DocxView
</commit_message>
<xml_diff>
--- a/sample/src/main/assets/sample.docx
+++ b/sample/src/main/assets/sample.docx
@@ -11,7 +11,7 @@
       </w:pPr>
       <w:r>
         <w:rPr/>
-        <w:t>Квартальный отчёт — Q3 2026</w:t>
+        <w:t>Quarterly Report — Q3 2026</w:t>
       </w:r>
     </w:p>
     <w:p>
@@ -24,11 +24,11 @@
         <w:rPr>
           <w:i/>
         </w:rPr>
-        <w:t>Подготовлено отделом аналитики.</w:t>
-      </w:r>
-      <w:r>
-        <w:rPr/>
-        <w:t xml:space="preserve"> Документ демонстрирует возможности SDK: заголовки, списки, таблицы, ссылки и изображения. Текст можно выделять, масштабировать щипком и искать по нему. The viewer reflows text for small screens, keeps tables scrollable and adapts colours to the dark theme. </w:t>
+        <w:t>Prepared by the analytics team.</w:t>
+      </w:r>
+      <w:r>
+        <w:rPr/>
+        <w:t xml:space="preserve"> This document shows what the SDK can do: headings, lists, tables, links and images. Text can be selected, scaled with a pinch and searched. The viewer reflows text for small screens, keeps tables scrollable and adapts colors to the dark theme. </w:t>
       </w:r>
     </w:p>
     <w:p>
@@ -39,7 +39,7 @@
       </w:pPr>
       <w:r>
         <w:rPr/>
-        <w:t>1. Ключевые показатели</w:t>
+        <w:t>1. Key metrics</w:t>
       </w:r>
     </w:p>
     <w:p>
@@ -51,37 +51,37 @@
       </w:pPr>
       <w:r>
         <w:rPr/>
-        <w:t xml:space="preserve">Выручка выросла на </w:t>
+        <w:t xml:space="preserve">Revenue grew by </w:t>
       </w:r>
       <w:r>
         <w:rPr>
           <w:b/>
         </w:rPr>
-        <w:t>18,4%</w:t>
-      </w:r>
-      <w:r>
-        <w:rPr/>
-        <w:t xml:space="preserve">, а </w:t>
+        <w:t>18.4%</w:t>
+      </w:r>
+      <w:r>
+        <w:rPr/>
+        <w:t xml:space="preserve">, while </w:t>
       </w:r>
       <w:r>
         <w:rPr>
           <w:color w:val="D32F2F"/>
         </w:rPr>
-        <w:t>отток клиентов</w:t>
-      </w:r>
-      <w:r>
-        <w:rPr/>
-        <w:t xml:space="preserve"> снизился до </w:t>
+        <w:t>customer churn</w:t>
+      </w:r>
+      <w:r>
+        <w:rPr/>
+        <w:t xml:space="preserve"> dropped to </w:t>
       </w:r>
       <w:r>
         <w:rPr>
           <w:u w:val="single"/>
         </w:rPr>
-        <w:t>2,1%</w:t>
-      </w:r>
-      <w:r>
-        <w:rPr/>
-        <w:t xml:space="preserve">. Подробности — на сайте </w:t>
+        <w:t>2.1%</w:t>
+      </w:r>
+      <w:r>
+        <w:rPr/>
+        <w:t xml:space="preserve">. Details are on the </w:t>
       </w:r>
       <w:hyperlink r:id="rId2">
         <w:r>
@@ -93,7 +93,7 @@
       </w:hyperlink>
       <w:r>
         <w:rPr/>
-        <w:t>.</w:t>
+        <w:t xml:space="preserve"> website.</w:t>
       </w:r>
     </w:p>
     <w:p>
@@ -114,13 +114,13 @@
       </w:pPr>
       <w:r>
         <w:rPr/>
-        <w:t xml:space="preserve">Новых пользователей: </w:t>
+        <w:t xml:space="preserve">New users: </w:t>
       </w:r>
       <w:r>
         <w:rPr>
           <w:b/>
         </w:rPr>
-        <w:t>124 500</w:t>
+        <w:t>124,500</w:t>
       </w:r>
     </w:p>
     <w:p>
@@ -141,7 +141,7 @@
       </w:pPr>
       <w:r>
         <w:rPr/>
-        <w:t>Средний чек: 2 340 ₽</w:t>
+        <w:t>Average order: $34.20</w:t>
       </w:r>
     </w:p>
     <w:p>
@@ -176,7 +176,7 @@
           <wp:inline distT="0" distB="0" distL="0" distR="0">
             <wp:extent cx="4572000" cy="2286000"/>
             <wp:effectExtent l="0" t="0" r="0" b="0"/>
-            <wp:docPr id="1" name="Image1" descr="Выручка по месяцам"/>
+            <wp:docPr id="1" name="Image1" descr="Revenue by month"/>
             <wp:cNvGraphicFramePr>
               <a:graphicFrameLocks xmlns:a="http://schemas.openxmlformats.org/drawingml/2006/main" noChangeAspect="1"/>
             </wp:cNvGraphicFramePr>
@@ -184,7 +184,7 @@
               <a:graphicData uri="http://schemas.openxmlformats.org/drawingml/2006/picture">
                 <pic:pic xmlns:pic="http://schemas.openxmlformats.org/drawingml/2006/picture">
                   <pic:nvPicPr>
-                    <pic:cNvPr id="1" name="Image1" descr="Выручка по месяцам"/>
+                    <pic:cNvPr id="1" name="Image1" descr="Revenue by month"/>
                     <pic:cNvPicPr>
                       <a:picLocks noChangeAspect="1" noChangeArrowheads="1"/>
                     </pic:cNvPicPr>
@@ -220,12 +220,12 @@
       </w:pPr>
       <w:r>
         <w:rPr/>
-        <w:t>2. Продажи по регионам</w:t>
+        <w:t>2. Sales by region</w:t>
       </w:r>
     </w:p>
     <w:tbl>
       <w:tblPr>
-        <w:tblW w:w="5779" w:type="dxa"/>
+        <w:tblW w:w="5121" w:type="dxa"/>
         <w:jc w:val="left"/>
         <w:tblInd w:w="60" w:type="dxa"/>
         <w:tblLayout w:type="fixed"/>
@@ -237,17 +237,17 @@
         </w:tblCellMar>
       </w:tblPr>
       <w:tblGrid>
-        <w:gridCol w:w="1953"/>
+        <w:gridCol w:w="1630"/>
         <w:gridCol w:w="830"/>
         <w:gridCol w:w="830"/>
         <w:gridCol w:w="830"/>
-        <w:gridCol w:w="1336"/>
+        <w:gridCol w:w="1001"/>
       </w:tblGrid>
       <w:tr>
         <w:trPr/>
         <w:tc>
           <w:tcPr>
-            <w:tcW w:w="1953" w:type="dxa"/>
+            <w:tcW w:w="1630" w:type="dxa"/>
             <w:tcBorders>
               <w:top w:val="double" w:sz="2" w:space="0" w:color="808080"/>
               <w:left w:val="double" w:sz="2" w:space="0" w:color="808080"/>
@@ -266,7 +266,7 @@
             </w:pPr>
             <w:r>
               <w:rPr/>
-              <w:t>Регион</w:t>
+              <w:t>Region</w:t>
             </w:r>
           </w:p>
         </w:tc>
@@ -347,7 +347,7 @@
         </w:tc>
         <w:tc>
           <w:tcPr>
-            <w:tcW w:w="1336" w:type="dxa"/>
+            <w:tcW w:w="1001" w:type="dxa"/>
             <w:tcBorders>
               <w:top w:val="double" w:sz="2" w:space="0" w:color="808080"/>
               <w:left w:val="double" w:sz="2" w:space="0" w:color="808080"/>
@@ -366,7 +366,7 @@
             </w:pPr>
             <w:r>
               <w:rPr/>
-              <w:t>Динамика</w:t>
+              <w:t>Change</w:t>
             </w:r>
           </w:p>
         </w:tc>
@@ -375,25 +375,25 @@
         <w:trPr/>
         <w:tc>
           <w:tcPr>
-            <w:tcW w:w="1953" w:type="dxa"/>
-            <w:tcBorders>
-              <w:left w:val="double" w:sz="2" w:space="0" w:color="808080"/>
-              <w:bottom w:val="double" w:sz="2" w:space="0" w:color="808080"/>
-              <w:right w:val="double" w:sz="2" w:space="0" w:color="808080"/>
-            </w:tcBorders>
-            <w:vAlign w:val="center"/>
-          </w:tcPr>
-          <w:p>
-            <w:pPr>
-              <w:pStyle w:val="TableContents"/>
-              <w:widowControl w:val="false"/>
-              <w:suppressLineNumbers/>
-              <w:bidi w:val="0"/>
-              <w:rPr/>
-            </w:pPr>
-            <w:r>
-              <w:rPr/>
-              <w:t>Москва</w:t>
+            <w:tcW w:w="1630" w:type="dxa"/>
+            <w:tcBorders>
+              <w:left w:val="double" w:sz="2" w:space="0" w:color="808080"/>
+              <w:bottom w:val="double" w:sz="2" w:space="0" w:color="808080"/>
+              <w:right w:val="double" w:sz="2" w:space="0" w:color="808080"/>
+            </w:tcBorders>
+            <w:vAlign w:val="center"/>
+          </w:tcPr>
+          <w:p>
+            <w:pPr>
+              <w:pStyle w:val="TableContents"/>
+              <w:widowControl w:val="false"/>
+              <w:suppressLineNumbers/>
+              <w:bidi w:val="0"/>
+              <w:rPr/>
+            </w:pPr>
+            <w:r>
+              <w:rPr/>
+              <w:t>North America</w:t>
             </w:r>
           </w:p>
         </w:tc>
@@ -417,7 +417,7 @@
             </w:pPr>
             <w:r>
               <w:rPr/>
-              <w:t>12 400</w:t>
+              <w:t>12,400</w:t>
             </w:r>
           </w:p>
         </w:tc>
@@ -441,7 +441,7 @@
             </w:pPr>
             <w:r>
               <w:rPr/>
-              <w:t>13 900</w:t>
+              <w:t>13,900</w:t>
             </w:r>
           </w:p>
         </w:tc>
@@ -465,13 +465,13 @@
             </w:pPr>
             <w:r>
               <w:rPr/>
-              <w:t>15 750</w:t>
-            </w:r>
-          </w:p>
-        </w:tc>
-        <w:tc>
-          <w:tcPr>
-            <w:tcW w:w="1336" w:type="dxa"/>
+              <w:t>15,750</w:t>
+            </w:r>
+          </w:p>
+        </w:tc>
+        <w:tc>
+          <w:tcPr>
+            <w:tcW w:w="1001" w:type="dxa"/>
             <w:tcBorders>
               <w:left w:val="double" w:sz="2" w:space="0" w:color="808080"/>
               <w:bottom w:val="double" w:sz="2" w:space="0" w:color="808080"/>
@@ -498,25 +498,25 @@
         <w:trPr/>
         <w:tc>
           <w:tcPr>
-            <w:tcW w:w="1953" w:type="dxa"/>
-            <w:tcBorders>
-              <w:left w:val="double" w:sz="2" w:space="0" w:color="808080"/>
-              <w:bottom w:val="double" w:sz="2" w:space="0" w:color="808080"/>
-              <w:right w:val="double" w:sz="2" w:space="0" w:color="808080"/>
-            </w:tcBorders>
-            <w:vAlign w:val="center"/>
-          </w:tcPr>
-          <w:p>
-            <w:pPr>
-              <w:pStyle w:val="TableContents"/>
-              <w:widowControl w:val="false"/>
-              <w:suppressLineNumbers/>
-              <w:bidi w:val="0"/>
-              <w:rPr/>
-            </w:pPr>
-            <w:r>
-              <w:rPr/>
-              <w:t>Санкт-Петербург</w:t>
+            <w:tcW w:w="1630" w:type="dxa"/>
+            <w:tcBorders>
+              <w:left w:val="double" w:sz="2" w:space="0" w:color="808080"/>
+              <w:bottom w:val="double" w:sz="2" w:space="0" w:color="808080"/>
+              <w:right w:val="double" w:sz="2" w:space="0" w:color="808080"/>
+            </w:tcBorders>
+            <w:vAlign w:val="center"/>
+          </w:tcPr>
+          <w:p>
+            <w:pPr>
+              <w:pStyle w:val="TableContents"/>
+              <w:widowControl w:val="false"/>
+              <w:suppressLineNumbers/>
+              <w:bidi w:val="0"/>
+              <w:rPr/>
+            </w:pPr>
+            <w:r>
+              <w:rPr/>
+              <w:t>Europe</w:t>
             </w:r>
           </w:p>
         </w:tc>
@@ -540,7 +540,7 @@
             </w:pPr>
             <w:r>
               <w:rPr/>
-              <w:t>8 100</w:t>
+              <w:t>8,100</w:t>
             </w:r>
           </w:p>
         </w:tc>
@@ -564,7 +564,7 @@
             </w:pPr>
             <w:r>
               <w:rPr/>
-              <w:t>8 650</w:t>
+              <w:t>8,650</w:t>
             </w:r>
           </w:p>
         </w:tc>
@@ -588,13 +588,13 @@
             </w:pPr>
             <w:r>
               <w:rPr/>
-              <w:t>9 920</w:t>
-            </w:r>
-          </w:p>
-        </w:tc>
-        <w:tc>
-          <w:tcPr>
-            <w:tcW w:w="1336" w:type="dxa"/>
+              <w:t>9,920</w:t>
+            </w:r>
+          </w:p>
+        </w:tc>
+        <w:tc>
+          <w:tcPr>
+            <w:tcW w:w="1001" w:type="dxa"/>
             <w:tcBorders>
               <w:left w:val="double" w:sz="2" w:space="0" w:color="808080"/>
               <w:bottom w:val="double" w:sz="2" w:space="0" w:color="808080"/>
@@ -621,25 +621,25 @@
         <w:trPr/>
         <w:tc>
           <w:tcPr>
-            <w:tcW w:w="1953" w:type="dxa"/>
-            <w:tcBorders>
-              <w:left w:val="double" w:sz="2" w:space="0" w:color="808080"/>
-              <w:bottom w:val="double" w:sz="2" w:space="0" w:color="808080"/>
-              <w:right w:val="double" w:sz="2" w:space="0" w:color="808080"/>
-            </w:tcBorders>
-            <w:vAlign w:val="center"/>
-          </w:tcPr>
-          <w:p>
-            <w:pPr>
-              <w:pStyle w:val="TableContents"/>
-              <w:widowControl w:val="false"/>
-              <w:suppressLineNumbers/>
-              <w:bidi w:val="0"/>
-              <w:rPr/>
-            </w:pPr>
-            <w:r>
-              <w:rPr/>
-              <w:t>Казань</w:t>
+            <w:tcW w:w="1630" w:type="dxa"/>
+            <w:tcBorders>
+              <w:left w:val="double" w:sz="2" w:space="0" w:color="808080"/>
+              <w:bottom w:val="double" w:sz="2" w:space="0" w:color="808080"/>
+              <w:right w:val="double" w:sz="2" w:space="0" w:color="808080"/>
+            </w:tcBorders>
+            <w:vAlign w:val="center"/>
+          </w:tcPr>
+          <w:p>
+            <w:pPr>
+              <w:pStyle w:val="TableContents"/>
+              <w:widowControl w:val="false"/>
+              <w:suppressLineNumbers/>
+              <w:bidi w:val="0"/>
+              <w:rPr/>
+            </w:pPr>
+            <w:r>
+              <w:rPr/>
+              <w:t>Asia Pacific</w:t>
             </w:r>
           </w:p>
         </w:tc>
@@ -663,7 +663,7 @@
             </w:pPr>
             <w:r>
               <w:rPr/>
-              <w:t>3 300</w:t>
+              <w:t>3,300</w:t>
             </w:r>
           </w:p>
         </w:tc>
@@ -687,7 +687,7 @@
             </w:pPr>
             <w:r>
               <w:rPr/>
-              <w:t>3 410</w:t>
+              <w:t>3,410</w:t>
             </w:r>
           </w:p>
         </w:tc>
@@ -711,13 +711,13 @@
             </w:pPr>
             <w:r>
               <w:rPr/>
-              <w:t>3 980</w:t>
-            </w:r>
-          </w:p>
-        </w:tc>
-        <w:tc>
-          <w:tcPr>
-            <w:tcW w:w="1336" w:type="dxa"/>
+              <w:t>3,980</w:t>
+            </w:r>
+          </w:p>
+        </w:tc>
+        <w:tc>
+          <w:tcPr>
+            <w:tcW w:w="1001" w:type="dxa"/>
             <w:tcBorders>
               <w:left w:val="double" w:sz="2" w:space="0" w:color="808080"/>
               <w:bottom w:val="double" w:sz="2" w:space="0" w:color="808080"/>
@@ -744,25 +744,25 @@
         <w:trPr/>
         <w:tc>
           <w:tcPr>
-            <w:tcW w:w="1953" w:type="dxa"/>
-            <w:tcBorders>
-              <w:left w:val="double" w:sz="2" w:space="0" w:color="808080"/>
-              <w:bottom w:val="double" w:sz="2" w:space="0" w:color="808080"/>
-              <w:right w:val="double" w:sz="2" w:space="0" w:color="808080"/>
-            </w:tcBorders>
-            <w:vAlign w:val="center"/>
-          </w:tcPr>
-          <w:p>
-            <w:pPr>
-              <w:pStyle w:val="TableContents"/>
-              <w:widowControl w:val="false"/>
-              <w:suppressLineNumbers/>
-              <w:bidi w:val="0"/>
-              <w:rPr/>
-            </w:pPr>
-            <w:r>
-              <w:rPr/>
-              <w:t>Новосибирск</w:t>
+            <w:tcW w:w="1630" w:type="dxa"/>
+            <w:tcBorders>
+              <w:left w:val="double" w:sz="2" w:space="0" w:color="808080"/>
+              <w:bottom w:val="double" w:sz="2" w:space="0" w:color="808080"/>
+              <w:right w:val="double" w:sz="2" w:space="0" w:color="808080"/>
+            </w:tcBorders>
+            <w:vAlign w:val="center"/>
+          </w:tcPr>
+          <w:p>
+            <w:pPr>
+              <w:pStyle w:val="TableContents"/>
+              <w:widowControl w:val="false"/>
+              <w:suppressLineNumbers/>
+              <w:bidi w:val="0"/>
+              <w:rPr/>
+            </w:pPr>
+            <w:r>
+              <w:rPr/>
+              <w:t>Latin America</w:t>
             </w:r>
           </w:p>
         </w:tc>
@@ -786,7 +786,7 @@
             </w:pPr>
             <w:r>
               <w:rPr/>
-              <w:t>2 870</w:t>
+              <w:t>2,870</w:t>
             </w:r>
           </w:p>
         </w:tc>
@@ -810,7 +810,7 @@
             </w:pPr>
             <w:r>
               <w:rPr/>
-              <w:t>3 020</w:t>
+              <w:t>3,020</w:t>
             </w:r>
           </w:p>
         </w:tc>
@@ -834,13 +834,13 @@
             </w:pPr>
             <w:r>
               <w:rPr/>
-              <w:t>3 150</w:t>
-            </w:r>
-          </w:p>
-        </w:tc>
-        <w:tc>
-          <w:tcPr>
-            <w:tcW w:w="1336" w:type="dxa"/>
+              <w:t>3,150</w:t>
+            </w:r>
+          </w:p>
+        </w:tc>
+        <w:tc>
+          <w:tcPr>
+            <w:tcW w:w="1001" w:type="dxa"/>
             <w:tcBorders>
               <w:left w:val="double" w:sz="2" w:space="0" w:color="808080"/>
               <w:bottom w:val="double" w:sz="2" w:space="0" w:color="808080"/>
@@ -872,7 +872,7 @@
       </w:pPr>
       <w:r>
         <w:rPr/>
-        <w:t>3. План на следующий квартал</w:t>
+        <w:t>3. Plan for next quarter</w:t>
       </w:r>
     </w:p>
     <w:p>
@@ -893,7 +893,7 @@
       </w:pPr>
       <w:r>
         <w:rPr/>
-        <w:t>Запустить просмотр документов в приложении.</w:t>
+        <w:t>Ship the in-app document viewer.</w:t>
       </w:r>
     </w:p>
     <w:p>
@@ -914,7 +914,7 @@
       </w:pPr>
       <w:r>
         <w:rPr/>
-        <w:t>Добавить поиск по PDF.</w:t>
+        <w:t>Add search to PDF documents.</w:t>
       </w:r>
     </w:p>
     <w:p>
@@ -934,7 +934,7 @@
       </w:pPr>
       <w:r>
         <w:rPr/>
-        <w:t>Поддержать тёмную тему.</w:t>
+        <w:t>Support the dark theme.</w:t>
       </w:r>
     </w:p>
     <w:p>
@@ -945,7 +945,7 @@
       </w:pPr>
       <w:r>
         <w:rPr/>
-        <w:t>3.1. Риски</w:t>
+        <w:t>3.1. Risks</w:t>
       </w:r>
     </w:p>
     <w:p>
@@ -956,7 +956,7 @@
       </w:pPr>
       <w:r>
         <w:rPr/>
-        <w:t xml:space="preserve">Документ демонстрирует возможности SDK: заголовки, списки, таблицы, ссылки и изображения. Текст можно выделять, масштабировать щипком и искать по нему. The viewer reflows text for small screens, keeps tables scrollable and adapts colours to the dark theme. Документ демонстрирует возможности SDK: заголовки, списки, таблицы, ссылки и изображения. Текст можно выделять, масштабировать щипком и искать по нему. The viewer reflows text for small screens, keeps tables scrollable and adapts colours to the dark theme. </w:t>
+        <w:t xml:space="preserve">This document shows what the SDK can do: headings, lists, tables, links and images. Text can be selected, scaled with a pinch and searched. The viewer reflows text for small screens, keeps tables scrollable and adapts colors to the dark theme. This document shows what the SDK can do: headings, lists, tables, links and images. Text can be selected, scaled with a pinch and searched. The viewer reflows text for small screens, keeps tables scrollable and adapts colors to the dark theme. </w:t>
       </w:r>
     </w:p>
     <w:p>
@@ -974,7 +974,7 @@
         <w:rPr>
           <w:b/>
         </w:rPr>
-        <w:t>Спасибо за внимание!</w:t>
+        <w:t>Thank you!</w:t>
       </w:r>
     </w:p>
     <w:sectPr>

</xml_diff>